<commit_message>
Manuali: password dimenticata, cambio password, risposta dalla partita, Riapri partita
Co-Authored-By: Claude Fable 5.1 <noreply@anthropic.com>
</commit_message>
<xml_diff>
--- a/docs/InCampo - Manuale giocatori.docx
+++ b/docs/InCampo - Manuale giocatori.docx
@@ -1562,7 +1562,22 @@
                 <w:rFonts w:ascii="Cambria" w:hAnsi="Cambria"/>
                 <w:sz w:val="20"/>
               </w:rPr>
-              <w:t>Statistiche della stagione e capocannonieri</w:t>
+              <w:t xml:space="preserve">Statistiche della stagione e capocannonieri; con </w:t>
+            </w:r>
+            <w:r>
+              <w:rPr>
+                <w:rFonts w:ascii="Cambria" w:hAnsi="Cambria"/>
+                <w:i/>
+                <w:sz w:val="20"/>
+              </w:rPr>
+              <w:t>Io</w:t>
+            </w:r>
+            <w:r>
+              <w:rPr>
+                <w:rFonts w:ascii="Cambria" w:hAnsi="Cambria"/>
+                <w:sz w:val="20"/>
+              </w:rPr>
+              <w:t xml:space="preserve"> vedi le tue: presenze, gol, assist, minuti</w:t>
             </w:r>
           </w:p>
         </w:tc>
@@ -2690,6 +2705,152 @@
           <w:b/>
           <w:sz w:val="21"/>
         </w:rPr>
+        <w:t>Ho dimenticato la password</w:t>
+      </w:r>
+    </w:p>
+    <w:p>
+      <w:pPr>
+        <w:spacing w:after="80" w:before="0"/>
+      </w:pPr>
+      <w:r>
+        <w:rPr>
+          <w:rFonts w:ascii="Cambria" w:hAnsi="Cambria"/>
+          <w:color w:val="4C4B45"/>
+        </w:rPr>
+        <w:t xml:space="preserve">Chiedi a chi amministra la squadra: dalla </w:t>
+      </w:r>
+      <w:r>
+        <w:rPr>
+          <w:rFonts w:ascii="Consolas" w:hAnsi="Consolas"/>
+          <w:color w:val="4C4B45"/>
+          <w:sz w:val="19"/>
+          <w:shd w:val="clear" w:fill="F2F1EC"/>
+        </w:rPr>
+        <w:t>Rosa</w:t>
+      </w:r>
+      <w:r>
+        <w:rPr>
+          <w:rFonts w:ascii="Cambria" w:hAnsi="Cambria"/>
+          <w:color w:val="4C4B45"/>
+        </w:rPr>
+        <w:t xml:space="preserve"> può impostartene una nuova in un attimo. Appena entri, cambiala da </w:t>
+      </w:r>
+      <w:r>
+        <w:rPr>
+          <w:rFonts w:ascii="Consolas" w:hAnsi="Consolas"/>
+          <w:color w:val="4C4B45"/>
+          <w:sz w:val="19"/>
+          <w:shd w:val="clear" w:fill="F2F1EC"/>
+        </w:rPr>
+        <w:t>Impostazioni</w:t>
+      </w:r>
+      <w:r>
+        <w:rPr>
+          <w:rFonts w:ascii="Cambria" w:hAnsi="Cambria"/>
+          <w:color w:val="4C4B45"/>
+        </w:rPr>
+        <w:t xml:space="preserve"> → </w:t>
+      </w:r>
+      <w:r>
+        <w:rPr>
+          <w:rFonts w:ascii="Consolas" w:hAnsi="Consolas"/>
+          <w:color w:val="4C4B45"/>
+          <w:sz w:val="19"/>
+          <w:shd w:val="clear" w:fill="F2F1EC"/>
+        </w:rPr>
+        <w:t>Account</w:t>
+      </w:r>
+      <w:r>
+        <w:rPr>
+          <w:rFonts w:ascii="Cambria" w:hAnsi="Cambria"/>
+          <w:color w:val="4C4B45"/>
+        </w:rPr>
+        <w:t xml:space="preserve"> → </w:t>
+      </w:r>
+      <w:r>
+        <w:rPr>
+          <w:rFonts w:ascii="Consolas" w:hAnsi="Consolas"/>
+          <w:color w:val="4C4B45"/>
+          <w:sz w:val="19"/>
+          <w:shd w:val="clear" w:fill="F2F1EC"/>
+        </w:rPr>
+        <w:t>Cambia password</w:t>
+      </w:r>
+      <w:r>
+        <w:rPr>
+          <w:rFonts w:ascii="Cambria" w:hAnsi="Cambria"/>
+          <w:color w:val="4C4B45"/>
+        </w:rPr>
+        <w:t>: serve la password attuale e la nuova, almeno 6 caratteri.</w:t>
+      </w:r>
+    </w:p>
+    <w:p>
+      <w:pPr>
+        <w:spacing w:after="40" w:before="120"/>
+      </w:pPr>
+      <w:r>
+        <w:rPr>
+          <w:rFonts w:ascii="Segoe UI" w:hAnsi="Segoe UI"/>
+          <w:b/>
+          <w:sz w:val="21"/>
+        </w:rPr>
+        <w:t>Ho aperto la notifica ma non trovo dove rispondere</w:t>
+      </w:r>
+    </w:p>
+    <w:p>
+      <w:pPr>
+        <w:spacing w:after="80" w:before="0"/>
+      </w:pPr>
+      <w:r>
+        <w:rPr>
+          <w:rFonts w:ascii="Cambria" w:hAnsi="Cambria"/>
+          <w:color w:val="4C4B45"/>
+        </w:rPr>
+        <w:t xml:space="preserve">Nella pagina della partita, subito sotto il biglietto, c'è il riquadro con la tua risposta: </w:t>
+      </w:r>
+      <w:r>
+        <w:rPr>
+          <w:rFonts w:ascii="Consolas" w:hAnsi="Consolas"/>
+          <w:color w:val="4C4B45"/>
+          <w:sz w:val="19"/>
+          <w:shd w:val="clear" w:fill="F2F1EC"/>
+        </w:rPr>
+        <w:t>Ci sono</w:t>
+      </w:r>
+      <w:r>
+        <w:rPr>
+          <w:rFonts w:ascii="Cambria" w:hAnsi="Cambria"/>
+          <w:color w:val="4C4B45"/>
+        </w:rPr>
+        <w:t xml:space="preserve"> o </w:t>
+      </w:r>
+      <w:r>
+        <w:rPr>
+          <w:rFonts w:ascii="Consolas" w:hAnsi="Consolas"/>
+          <w:color w:val="4C4B45"/>
+          <w:sz w:val="19"/>
+          <w:shd w:val="clear" w:fill="F2F1EC"/>
+        </w:rPr>
+        <w:t>Non ci sono</w:t>
+      </w:r>
+      <w:r>
+        <w:rPr>
+          <w:rFonts w:ascii="Cambria" w:hAnsi="Cambria"/>
+          <w:color w:val="4C4B45"/>
+        </w:rPr>
+        <w:t>. Se non sei stato convocato il riquadro chiede la disponibilità, che serve al mister per scegliere.</w:t>
+      </w:r>
+    </w:p>
+    <w:p>
+      <w:pPr>
+        <w:spacing w:after="40" w:before="120"/>
+      </w:pPr>
+      <w:r>
+        <w:rPr>
+          <w:rFonts w:ascii="Segoe UI" w:hAnsi="Segoe UI"/>
+          <w:b/>
+          <w:sz w:val="21"/>
+        </w:rPr>
         <w:t>Vedo la squadra sbagliata</w:t>
       </w:r>
     </w:p>

</xml_diff>

<commit_message>
Manuali: sostituto con un tocco, turni, condividi, QR invito, MVP, affidabilita', uscite e cruscotto cassa
Co-Authored-By: Claude Fable 5.1 <noreply@anthropic.com>
</commit_message>
<xml_diff>
--- a/docs/InCampo - Manuale giocatori.docx
+++ b/docs/InCampo - Manuale giocatori.docx
@@ -685,6 +685,43 @@
           <w:color w:val="4C4B45"/>
         </w:rPr>
         <w:t xml:space="preserve"> della squadra: chiedilo a chi la gestisce. È una stringa breve che vale per tutti.</w:t>
+      </w:r>
+    </w:p>
+    <w:p>
+      <w:pPr>
+        <w:spacing w:after="160" w:before="0"/>
+      </w:pPr>
+      <w:r>
+        <w:rPr>
+          <w:rFonts w:ascii="Cambria" w:hAnsi="Cambria"/>
+        </w:rPr>
+        <w:t xml:space="preserve">Se ti hanno mandato un </w:t>
+      </w:r>
+      <w:r>
+        <w:rPr>
+          <w:rFonts w:ascii="Cambria" w:hAnsi="Cambria"/>
+          <w:b/>
+        </w:rPr>
+        <w:t>link</w:t>
+      </w:r>
+      <w:r>
+        <w:rPr>
+          <w:rFonts w:ascii="Cambria" w:hAnsi="Cambria"/>
+        </w:rPr>
+        <w:t xml:space="preserve"> o fatto scansionare un </w:t>
+      </w:r>
+      <w:r>
+        <w:rPr>
+          <w:rFonts w:ascii="Cambria" w:hAnsi="Cambria"/>
+          <w:b/>
+        </w:rPr>
+        <w:t>QR</w:t>
+      </w:r>
+      <w:r>
+        <w:rPr>
+          <w:rFonts w:ascii="Cambria" w:hAnsi="Cambria"/>
+        </w:rPr>
+        <w:t>, salta il codice: aprendolo trovi già la squadra verificata e devi solo scrivere il tuo nome. Se non hai ancora un account, l'app ti fa registrare e poi torna lì da sola.</w:t>
       </w:r>
     </w:p>
     <w:p>
@@ -1562,7 +1599,7 @@
                 <w:rFonts w:ascii="Cambria" w:hAnsi="Cambria"/>
                 <w:sz w:val="20"/>
               </w:rPr>
-              <w:t xml:space="preserve">Statistiche della stagione e capocannonieri; con </w:t>
+              <w:t xml:space="preserve">Statistiche della stagione, capocannonieri e classifica del migliore in campo; con </w:t>
             </w:r>
             <w:r>
               <w:rPr>
@@ -1577,7 +1614,7 @@
                 <w:rFonts w:ascii="Cambria" w:hAnsi="Cambria"/>
                 <w:sz w:val="20"/>
               </w:rPr>
-              <w:t xml:space="preserve"> vedi le tue: presenze, gol, assist, minuti</w:t>
+              <w:t xml:space="preserve"> vedi le tue: presenze, gol, assist, minuti, voti ricevuti e affidabilità</w:t>
             </w:r>
           </w:p>
         </w:tc>
@@ -1862,6 +1899,34 @@
           <w:rFonts w:ascii="Cambria" w:hAnsi="Cambria"/>
           <w:b/>
         </w:rPr>
+        <w:t>I turni.</w:t>
+      </w:r>
+      <w:r>
+        <w:rPr>
+          <w:rFonts w:ascii="Cambria" w:hAnsi="Cambria"/>
+        </w:rPr>
+        <w:t xml:space="preserve"> Se la squadra li usa, nel dettaglio della partita vedi a chi toccano casacche, palloni o maglie: li assegna l'app a rotazione tra i convocati, il mister può correggere. Se c'è il tuo nome, tocca a te.</w:t>
+      </w:r>
+    </w:p>
+    <w:p>
+      <w:pPr>
+        <w:spacing w:after="100" w:before="0"/>
+        <w:ind w:left="461" w:hanging="461"/>
+      </w:pPr>
+      <w:r>
+        <w:rPr>
+          <w:rFonts w:ascii="Segoe UI" w:hAnsi="Segoe UI"/>
+          <w:b/>
+          <w:color w:val="006B45"/>
+        </w:rPr>
+        <w:t>5.</w:t>
+        <w:tab/>
+      </w:r>
+      <w:r>
+        <w:rPr>
+          <w:rFonts w:ascii="Cambria" w:hAnsi="Cambria"/>
+          <w:b/>
+        </w:rPr>
         <w:t>Dopo la partita.</w:t>
       </w:r>
       <w:r>
@@ -1869,6 +1934,62 @@
           <w:rFonts w:ascii="Cambria" w:hAnsi="Cambria"/>
         </w:rPr>
         <w:t xml:space="preserve"> Il mister segna chi c'era davvero. Da lì si scala il gettone e, se paghi a partita, può arrivarti l'addebito.</w:t>
+      </w:r>
+    </w:p>
+    <w:p>
+      <w:pPr>
+        <w:spacing w:after="100" w:before="0"/>
+        <w:ind w:left="461" w:hanging="461"/>
+      </w:pPr>
+      <w:r>
+        <w:rPr>
+          <w:rFonts w:ascii="Segoe UI" w:hAnsi="Segoe UI"/>
+          <w:b/>
+          <w:color w:val="006B45"/>
+        </w:rPr>
+        <w:t>6.</w:t>
+        <w:tab/>
+      </w:r>
+      <w:r>
+        <w:rPr>
+          <w:rFonts w:ascii="Cambria" w:hAnsi="Cambria"/>
+          <w:b/>
+        </w:rPr>
+        <w:t>Vota il migliore in campo.</w:t>
+      </w:r>
+      <w:r>
+        <w:rPr>
+          <w:rFonts w:ascii="Cambria" w:hAnsi="Cambria"/>
+        </w:rPr>
+        <w:t xml:space="preserve"> A partita conclusa, aprila: nel riquadro </w:t>
+      </w:r>
+      <w:r>
+        <w:rPr>
+          <w:rFonts w:ascii="Consolas" w:hAnsi="Consolas"/>
+          <w:sz w:val="19"/>
+          <w:shd w:val="clear" w:fill="F2F1EC"/>
+        </w:rPr>
+        <w:t>MIGLIORE IN CAMPO</w:t>
+      </w:r>
+      <w:r>
+        <w:rPr>
+          <w:rFonts w:ascii="Cambria" w:hAnsi="Cambria"/>
+        </w:rPr>
+        <w:t xml:space="preserve"> scegli uno tra i presenti (non te stesso). Un voto a testa, puoi cambiarlo o toglierlo. Chi vince entra nella classifica in </w:t>
+      </w:r>
+      <w:r>
+        <w:rPr>
+          <w:rFonts w:ascii="Consolas" w:hAnsi="Consolas"/>
+          <w:sz w:val="19"/>
+          <w:shd w:val="clear" w:fill="F2F1EC"/>
+        </w:rPr>
+        <w:t>Stats</w:t>
+      </w:r>
+      <w:r>
+        <w:rPr>
+          <w:rFonts w:ascii="Cambria" w:hAnsi="Cambria"/>
+        </w:rPr>
+        <w:t>.</w:t>
       </w:r>
     </w:p>
     <w:tbl>
@@ -1939,7 +2060,37 @@
                 <w:rFonts w:ascii="Cambria" w:hAnsi="Cambria"/>
                 <w:sz w:val="20"/>
               </w:rPr>
-              <w:t xml:space="preserve"> te la manda il mister a un gruppo ristretto, e la sua risposta è quella definitiva. Può capitare di essere disponibili e non convocati: è normale, soprattutto quando i convocati per partita hanno un tetto massimo.</w:t>
+              <w:t xml:space="preserve"> te la manda il mister a un gruppo ristretto, e la sua risposta è quella definitiva. Può capitare di essere disponibili e non convocati: è normale, soprattutto quando i convocati per partita hanno un tetto massimo. Se qualcuno dà forfait, il mister vede subito chi era disponibile e può convocarlo con un tocco: per questo vale la pena dare la disponibilità anche quando non ti aspetti di giocare. Le tue risposte contano: nella scheda </w:t>
+            </w:r>
+            <w:r>
+              <w:rPr>
+                <w:rFonts w:ascii="Consolas" w:hAnsi="Consolas"/>
+                <w:sz w:val="19"/>
+                <w:shd w:val="clear" w:fill="F2F1EC"/>
+              </w:rPr>
+              <w:t>Io</w:t>
+            </w:r>
+            <w:r>
+              <w:rPr>
+                <w:rFonts w:ascii="Cambria" w:hAnsi="Cambria"/>
+                <w:sz w:val="20"/>
+              </w:rPr>
+              <w:t xml:space="preserve"> delle statistiche vedi la tua </w:t>
+            </w:r>
+            <w:r>
+              <w:rPr>
+                <w:rFonts w:ascii="Cambria" w:hAnsi="Cambria"/>
+                <w:b/>
+                <w:sz w:val="20"/>
+              </w:rPr>
+              <w:t>affidabilità</w:t>
+            </w:r>
+            <w:r>
+              <w:rPr>
+                <w:rFonts w:ascii="Cambria" w:hAnsi="Cambria"/>
+                <w:sz w:val="20"/>
+              </w:rPr>
+              <w:t>, cioè quante convocazioni hai confermato, e il mister la vede quando sceglie chi chiamare.</w:t>
             </w:r>
           </w:p>
         </w:tc>

</xml_diff>

<commit_message>
Manuale giocatori: riepilogo Le mie partite e tasti della Home
Co-Authored-By: Claude Fable 5.1 <noreply@anthropic.com>
</commit_message>
<xml_diff>
--- a/docs/InCampo - Manuale giocatori.docx
+++ b/docs/InCampo - Manuale giocatori.docx
@@ -1451,7 +1451,22 @@
                 <w:rFonts w:ascii="Cambria" w:hAnsi="Cambria"/>
                 <w:sz w:val="20"/>
               </w:rPr>
-              <w:t>La prossima partita con i tasti per rispondere, chi c'è stasera, i tuoi gettoni, l'ultimo avviso</w:t>
+              <w:t xml:space="preserve">La prossima partita con i tasti per rispondere, il riepilogo </w:t>
+            </w:r>
+            <w:r>
+              <w:rPr>
+                <w:rFonts w:ascii="Cambria" w:hAnsi="Cambria"/>
+                <w:i/>
+                <w:sz w:val="20"/>
+              </w:rPr>
+              <w:t>Le mie partite</w:t>
+            </w:r>
+            <w:r>
+              <w:rPr>
+                <w:rFonts w:ascii="Cambria" w:hAnsi="Cambria"/>
+                <w:sz w:val="20"/>
+              </w:rPr>
+              <w:t xml:space="preserve"> (per ogni partita in arrivo: cosa hai risposto e se sei convocato), chi c'è stasera, i tuoi gettoni, l'ultimo avviso</w:t>
             </w:r>
           </w:p>
         </w:tc>
@@ -1849,7 +1864,7 @@
         <w:rPr>
           <w:rFonts w:ascii="Cambria" w:hAnsi="Cambria"/>
         </w:rPr>
-        <w:t>. Questa è la risposta che conta per la distinta.</w:t>
+        <w:t>. Questa è la risposta che conta per la distinta. Sulla Home, gli stessi due tasti sotto la partita rispondono alla convocazione se sei convocato, alla disponibilità altrimenti: sopra c'è scritto a quale delle due stai rispondendo, e sotto cosa hai risposto.</w:t>
       </w:r>
     </w:p>
     <w:p>
@@ -1990,6 +2005,150 @@
           <w:rFonts w:ascii="Cambria" w:hAnsi="Cambria"/>
         </w:rPr>
         <w:t>.</w:t>
+      </w:r>
+    </w:p>
+    <w:p>
+      <w:pPr>
+        <w:pStyle w:val="Heading2"/>
+        <w:spacing w:before="200" w:after="80"/>
+      </w:pPr>
+      <w:r>
+        <w:rPr>
+          <w:rFonts w:ascii="Segoe UI" w:hAnsi="Segoe UI"/>
+          <w:b/>
+          <w:color w:val="14181A"/>
+          <w:sz w:val="24"/>
+        </w:rPr>
+        <w:t>Dove vedo cosa ho risposto</w:t>
+      </w:r>
+    </w:p>
+    <w:p>
+      <w:pPr>
+        <w:spacing w:after="160" w:before="0"/>
+      </w:pPr>
+      <w:r>
+        <w:rPr>
+          <w:rFonts w:ascii="Cambria" w:hAnsi="Cambria"/>
+        </w:rPr>
+        <w:t xml:space="preserve">Sulla Home, subito sotto la prossima partita, il riquadro </w:t>
+      </w:r>
+      <w:r>
+        <w:rPr>
+          <w:rFonts w:ascii="Consolas" w:hAnsi="Consolas"/>
+          <w:sz w:val="19"/>
+          <w:shd w:val="clear" w:fill="F2F1EC"/>
+        </w:rPr>
+        <w:t>Le mie partite</w:t>
+      </w:r>
+      <w:r>
+        <w:rPr>
+          <w:rFonts w:ascii="Cambria" w:hAnsi="Cambria"/>
+        </w:rPr>
+        <w:t xml:space="preserve"> elenca le partite in arrivo con due etichette per ciascuna: la tua disponibilità (</w:t>
+      </w:r>
+      <w:r>
+        <w:rPr>
+          <w:rFonts w:ascii="Cambria" w:hAnsi="Cambria"/>
+          <w:i/>
+        </w:rPr>
+        <w:t>Ci sono</w:t>
+      </w:r>
+      <w:r>
+        <w:rPr>
+          <w:rFonts w:ascii="Cambria" w:hAnsi="Cambria"/>
+        </w:rPr>
+        <w:t xml:space="preserve">, </w:t>
+      </w:r>
+      <w:r>
+        <w:rPr>
+          <w:rFonts w:ascii="Cambria" w:hAnsi="Cambria"/>
+          <w:i/>
+        </w:rPr>
+        <w:t>Salto</w:t>
+      </w:r>
+      <w:r>
+        <w:rPr>
+          <w:rFonts w:ascii="Cambria" w:hAnsi="Cambria"/>
+        </w:rPr>
+        <w:t xml:space="preserve">, </w:t>
+      </w:r>
+      <w:r>
+        <w:rPr>
+          <w:rFonts w:ascii="Cambria" w:hAnsi="Cambria"/>
+          <w:i/>
+        </w:rPr>
+        <w:t>Non risposto</w:t>
+      </w:r>
+      <w:r>
+        <w:rPr>
+          <w:rFonts w:ascii="Cambria" w:hAnsi="Cambria"/>
+        </w:rPr>
+        <w:t>) e la convocazione (</w:t>
+      </w:r>
+      <w:r>
+        <w:rPr>
+          <w:rFonts w:ascii="Cambria" w:hAnsi="Cambria"/>
+          <w:i/>
+        </w:rPr>
+        <w:t>Convocazioni in arrivo</w:t>
+      </w:r>
+      <w:r>
+        <w:rPr>
+          <w:rFonts w:ascii="Cambria" w:hAnsi="Cambria"/>
+        </w:rPr>
+        <w:t xml:space="preserve"> finché il mister non le manda, poi </w:t>
+      </w:r>
+      <w:r>
+        <w:rPr>
+          <w:rFonts w:ascii="Cambria" w:hAnsi="Cambria"/>
+          <w:i/>
+        </w:rPr>
+        <w:t>Convocato ✓</w:t>
+      </w:r>
+      <w:r>
+        <w:rPr>
+          <w:rFonts w:ascii="Cambria" w:hAnsi="Cambria"/>
+        </w:rPr>
+        <w:t xml:space="preserve">, </w:t>
+      </w:r>
+      <w:r>
+        <w:rPr>
+          <w:rFonts w:ascii="Cambria" w:hAnsi="Cambria"/>
+          <w:i/>
+        </w:rPr>
+        <w:t>Conferma!</w:t>
+      </w:r>
+      <w:r>
+        <w:rPr>
+          <w:rFonts w:ascii="Cambria" w:hAnsi="Cambria"/>
+        </w:rPr>
+        <w:t xml:space="preserve">, </w:t>
+      </w:r>
+      <w:r>
+        <w:rPr>
+          <w:rFonts w:ascii="Cambria" w:hAnsi="Cambria"/>
+          <w:i/>
+        </w:rPr>
+        <w:t>Forfait</w:t>
+      </w:r>
+      <w:r>
+        <w:rPr>
+          <w:rFonts w:ascii="Cambria" w:hAnsi="Cambria"/>
+        </w:rPr>
+        <w:t xml:space="preserve"> o </w:t>
+      </w:r>
+      <w:r>
+        <w:rPr>
+          <w:rFonts w:ascii="Cambria" w:hAnsi="Cambria"/>
+          <w:i/>
+        </w:rPr>
+        <w:t>Non convocato</w:t>
+      </w:r>
+      <w:r>
+        <w:rPr>
+          <w:rFonts w:ascii="Cambria" w:hAnsi="Cambria"/>
+        </w:rPr>
+        <w:t>). Toccando una riga si apre la partita, dove puoi cambiare risposta.</w:t>
       </w:r>
     </w:p>
     <w:tbl>

</xml_diff>

<commit_message>
Migrazione AddPlayerGioca: default true e backfill (in prod aveva marcato tutti come staff, corretto a mano); manuali: staff che non gioca, calendario iPhone/Android
Co-Authored-By: Claude Fable 5.1 <noreply@anthropic.com>
</commit_message>
<xml_diff>
--- a/docs/InCampo - Manuale giocatori.docx
+++ b/docs/InCampo - Manuale giocatori.docx
@@ -1466,7 +1466,22 @@
                 <w:rFonts w:ascii="Cambria" w:hAnsi="Cambria"/>
                 <w:sz w:val="20"/>
               </w:rPr>
-              <w:t xml:space="preserve"> (per ogni partita in arrivo: cosa hai risposto e se sei convocato), chi c'è stasera, i tuoi gettoni, l'ultimo avviso</w:t>
+              <w:t xml:space="preserve">, chi c'è stasera tra i giocatori e, a parte, chi c'è </w:t>
+            </w:r>
+            <w:r>
+              <w:rPr>
+                <w:rFonts w:ascii="Cambria" w:hAnsi="Cambria"/>
+                <w:i/>
+                <w:sz w:val="20"/>
+              </w:rPr>
+              <w:t>in panchina</w:t>
+            </w:r>
+            <w:r>
+              <w:rPr>
+                <w:rFonts w:ascii="Cambria" w:hAnsi="Cambria"/>
+                <w:sz w:val="20"/>
+              </w:rPr>
+              <w:t xml:space="preserve"> (mister e staff) (per ogni partita in arrivo: cosa hai risposto e se sei convocato), i tuoi gettoni, l'ultimo avviso</w:t>
             </w:r>
           </w:p>
         </w:tc>
@@ -2259,6 +2274,114 @@
       <w:pPr>
         <w:spacing w:after="160" w:before="0"/>
       </w:pPr>
+    </w:p>
+    <w:p>
+      <w:pPr>
+        <w:pStyle w:val="Heading2"/>
+        <w:spacing w:before="200" w:after="80"/>
+      </w:pPr>
+      <w:r>
+        <w:rPr>
+          <w:rFonts w:ascii="Segoe UI" w:hAnsi="Segoe UI"/>
+          <w:b/>
+          <w:color w:val="14181A"/>
+          <w:sz w:val="24"/>
+        </w:rPr>
+        <w:t>Le partite nel calendario del telefono</w:t>
+      </w:r>
+    </w:p>
+    <w:p>
+      <w:pPr>
+        <w:spacing w:after="160" w:before="0"/>
+      </w:pPr>
+      <w:r>
+        <w:rPr>
+          <w:rFonts w:ascii="Cambria" w:hAnsi="Cambria"/>
+        </w:rPr>
+        <w:t xml:space="preserve">Dalla scheda </w:t>
+      </w:r>
+      <w:r>
+        <w:rPr>
+          <w:rFonts w:ascii="Consolas" w:hAnsi="Consolas"/>
+          <w:sz w:val="19"/>
+          <w:shd w:val="clear" w:fill="F2F1EC"/>
+        </w:rPr>
+        <w:t>Partite</w:t>
+      </w:r>
+      <w:r>
+        <w:rPr>
+          <w:rFonts w:ascii="Cambria" w:hAnsi="Cambria"/>
+        </w:rPr>
+        <w:t xml:space="preserve">, l'icona del calendario in alto apre le opzioni. Su </w:t>
+      </w:r>
+      <w:r>
+        <w:rPr>
+          <w:rFonts w:ascii="Cambria" w:hAnsi="Cambria"/>
+          <w:b/>
+        </w:rPr>
+        <w:t>iPhone e Mac</w:t>
+      </w:r>
+      <w:r>
+        <w:rPr>
+          <w:rFonts w:ascii="Cambria" w:hAnsi="Cambria"/>
+        </w:rPr>
+        <w:t xml:space="preserve"> tocca </w:t>
+      </w:r>
+      <w:r>
+        <w:rPr>
+          <w:rFonts w:ascii="Consolas" w:hAnsi="Consolas"/>
+          <w:sz w:val="19"/>
+          <w:shd w:val="clear" w:fill="F2F1EC"/>
+        </w:rPr>
+        <w:t>Iscriviti</w:t>
+      </w:r>
+      <w:r>
+        <w:rPr>
+          <w:rFonts w:ascii="Cambria" w:hAnsi="Cambria"/>
+        </w:rPr>
+        <w:t xml:space="preserve">: si apre Calendario e chiede di aggiungere l'abbonamento alla squadra, che poi si aggiorna da solo quando il mister sposta una partita. Su </w:t>
+      </w:r>
+      <w:r>
+        <w:rPr>
+          <w:rFonts w:ascii="Cambria" w:hAnsi="Cambria"/>
+          <w:b/>
+        </w:rPr>
+        <w:t>Android</w:t>
+      </w:r>
+      <w:r>
+        <w:rPr>
+          <w:rFonts w:ascii="Cambria" w:hAnsi="Cambria"/>
+        </w:rPr>
+        <w:t xml:space="preserve"> tocca </w:t>
+      </w:r>
+      <w:r>
+        <w:rPr>
+          <w:rFonts w:ascii="Consolas" w:hAnsi="Consolas"/>
+          <w:sz w:val="19"/>
+          <w:shd w:val="clear" w:fill="F2F1EC"/>
+        </w:rPr>
+        <w:t>Google Calendar</w:t>
+      </w:r>
+      <w:r>
+        <w:rPr>
+          <w:rFonts w:ascii="Cambria" w:hAnsi="Cambria"/>
+        </w:rPr>
+        <w:t xml:space="preserve">: il calendario della squadra si aggiunge al tuo account Google. In alternativa puoi scaricare il file .ics o copiare il link da incollare in qualsiasi app calendario. Dal dettaglio di una singola partita, l'icona </w:t>
+      </w:r>
+      <w:r>
+        <w:rPr>
+          <w:rFonts w:ascii="Consolas" w:hAnsi="Consolas"/>
+          <w:sz w:val="19"/>
+          <w:shd w:val="clear" w:fill="F2F1EC"/>
+        </w:rPr>
+        <w:t>Aggiungi al calendario</w:t>
+      </w:r>
+      <w:r>
+        <w:rPr>
+          <w:rFonts w:ascii="Cambria" w:hAnsi="Cambria"/>
+        </w:rPr>
+        <w:t xml:space="preserve"> mette in agenda solo quella.</w:t>
+      </w:r>
     </w:p>
     <w:p>
       <w:pPr>

</xml_diff>

<commit_message>
Manuali: passata completa sulle novità del 13/9 (Home con tasti e chip, staff in panchina, notifiche, etichette reali, FAQ)
Co-Authored-By: Claude Fable 5.1 <noreply@anthropic.com>
</commit_message>
<xml_diff>
--- a/docs/InCampo - Manuale giocatori.docx
+++ b/docs/InCampo - Manuale giocatori.docx
@@ -1182,7 +1182,7 @@
                 <w:rFonts w:ascii="Cambria" w:hAnsi="Cambria"/>
                 <w:sz w:val="20"/>
               </w:rPr>
-              <w:t>Quando vieni convocato per una partita</w:t>
+              <w:t>Quando vieni convocato per una partita, e se il mister ti toglie dalla lista ("convocazione revocata")</w:t>
             </w:r>
           </w:p>
         </w:tc>
@@ -1451,7 +1451,7 @@
                 <w:rFonts w:ascii="Cambria" w:hAnsi="Cambria"/>
                 <w:sz w:val="20"/>
               </w:rPr>
-              <w:t xml:space="preserve">La prossima partita con i tasti per rispondere, il riepilogo </w:t>
+              <w:t xml:space="preserve">La prossima partita con i due tasti per rispondere; il riepilogo </w:t>
             </w:r>
             <w:r>
               <w:rPr>
@@ -1466,7 +1466,7 @@
                 <w:rFonts w:ascii="Cambria" w:hAnsi="Cambria"/>
                 <w:sz w:val="20"/>
               </w:rPr>
-              <w:t xml:space="preserve">, chi c'è stasera tra i giocatori e, a parte, chi c'è </w:t>
+              <w:t xml:space="preserve"> (per ogni partita in arrivo: cosa hai risposto e se sei convocato); chi c'è stasera tra i giocatori e, a parte, chi c'è </w:t>
             </w:r>
             <w:r>
               <w:rPr>
@@ -1481,7 +1481,7 @@
                 <w:rFonts w:ascii="Cambria" w:hAnsi="Cambria"/>
                 <w:sz w:val="20"/>
               </w:rPr>
-              <w:t xml:space="preserve"> (mister e staff) (per ogni partita in arrivo: cosa hai risposto e se sei convocato), i tuoi gettoni, l'ultimo avviso</w:t>
+              <w:t xml:space="preserve"> (mister e staff); i tuoi gettoni; l'ultimo avviso</w:t>
             </w:r>
           </w:p>
         </w:tc>
@@ -1555,7 +1555,7 @@
                 <w:rFonts w:ascii="Cambria" w:hAnsi="Cambria"/>
                 <w:sz w:val="20"/>
               </w:rPr>
-              <w:t>Tutti i compagni con numero di maglia e ruolo</w:t>
+              <w:t>Tutti i compagni con numero di maglia e ruolo; mister e dirigenti che non giocano sono segnati come staff</w:t>
             </w:r>
           </w:p>
         </w:tc>
@@ -1804,7 +1804,21 @@
           <w:sz w:val="19"/>
           <w:shd w:val="clear" w:fill="F2F1EC"/>
         </w:rPr>
-        <w:t>Non ci sono</w:t>
+        <w:t>Salto</w:t>
+      </w:r>
+      <w:r>
+        <w:rPr>
+          <w:rFonts w:ascii="Cambria" w:hAnsi="Cambria"/>
+        </w:rPr>
+        <w:t xml:space="preserve"> sotto la scritta </w:t>
+      </w:r>
+      <w:r>
+        <w:rPr>
+          <w:rFonts w:ascii="Consolas" w:hAnsi="Consolas"/>
+          <w:sz w:val="19"/>
+          <w:shd w:val="clear" w:fill="F2F1EC"/>
+        </w:rPr>
+        <w:t>DISPONIBILITÀ: CI SEI?</w:t>
       </w:r>
       <w:r>
         <w:rPr>
@@ -1823,7 +1837,7 @@
         <w:rPr>
           <w:rFonts w:ascii="Cambria" w:hAnsi="Cambria"/>
         </w:rPr>
-        <w:t xml:space="preserve"> di scegliere la formazione: rispondi presto, anche se poi cambia qualcosa.</w:t>
+        <w:t xml:space="preserve"> di scegliere la formazione: rispondi presto, anche se poi cambia qualcosa. Il tasto che hai scelto resta acceso, l'altro si spegne, e sotto c'è scritto cosa succede dopo.</w:t>
       </w:r>
     </w:p>
     <w:p>
@@ -1879,7 +1893,86 @@
         <w:rPr>
           <w:rFonts w:ascii="Cambria" w:hAnsi="Cambria"/>
         </w:rPr>
-        <w:t>. Questa è la risposta che conta per la distinta. Sulla Home, gli stessi due tasti sotto la partita rispondono alla convocazione se sei convocato, alla disponibilità altrimenti: sopra c'è scritto a quale delle due stai rispondendo, e sotto cosa hai risposto.</w:t>
+        <w:t xml:space="preserve">. Questa è la risposta che conta per la distinta. Sulla Home gli stessi due tasti rispondono alla convocazione quando sei convocato (la scritta sopra diventa </w:t>
+      </w:r>
+      <w:r>
+        <w:rPr>
+          <w:rFonts w:ascii="Consolas" w:hAnsi="Consolas"/>
+          <w:sz w:val="19"/>
+          <w:shd w:val="clear" w:fill="F2F1EC"/>
+        </w:rPr>
+        <w:t>SEI CONVOCATO: CI SEI?</w:t>
+      </w:r>
+      <w:r>
+        <w:rPr>
+          <w:rFonts w:ascii="Cambria" w:hAnsi="Cambria"/>
+        </w:rPr>
+        <w:t xml:space="preserve">) e alla disponibilità altrimenti. Il chip in alto a destra sul biglietto dice sempre dove sei: </w:t>
+      </w:r>
+      <w:r>
+        <w:rPr>
+          <w:rFonts w:ascii="Cambria" w:hAnsi="Cambria"/>
+          <w:i/>
+        </w:rPr>
+        <w:t>Convocazioni in arrivo</w:t>
+      </w:r>
+      <w:r>
+        <w:rPr>
+          <w:rFonts w:ascii="Cambria" w:hAnsi="Cambria"/>
+        </w:rPr>
+        <w:t xml:space="preserve">, </w:t>
+      </w:r>
+      <w:r>
+        <w:rPr>
+          <w:rFonts w:ascii="Cambria" w:hAnsi="Cambria"/>
+          <w:i/>
+        </w:rPr>
+        <w:t>Convocato · rispondi</w:t>
+      </w:r>
+      <w:r>
+        <w:rPr>
+          <w:rFonts w:ascii="Cambria" w:hAnsi="Cambria"/>
+        </w:rPr>
+        <w:t xml:space="preserve">, </w:t>
+      </w:r>
+      <w:r>
+        <w:rPr>
+          <w:rFonts w:ascii="Cambria" w:hAnsi="Cambria"/>
+          <w:i/>
+        </w:rPr>
+        <w:t>Convocato · confermato</w:t>
+      </w:r>
+      <w:r>
+        <w:rPr>
+          <w:rFonts w:ascii="Cambria" w:hAnsi="Cambria"/>
+        </w:rPr>
+        <w:t xml:space="preserve">, </w:t>
+      </w:r>
+      <w:r>
+        <w:rPr>
+          <w:rFonts w:ascii="Cambria" w:hAnsi="Cambria"/>
+          <w:i/>
+        </w:rPr>
+        <w:t>Convocato · forfait</w:t>
+      </w:r>
+      <w:r>
+        <w:rPr>
+          <w:rFonts w:ascii="Cambria" w:hAnsi="Cambria"/>
+        </w:rPr>
+        <w:t xml:space="preserve"> oppure </w:t>
+      </w:r>
+      <w:r>
+        <w:rPr>
+          <w:rFonts w:ascii="Cambria" w:hAnsi="Cambria"/>
+          <w:i/>
+        </w:rPr>
+        <w:t>Non convocato</w:t>
+      </w:r>
+      <w:r>
+        <w:rPr>
+          <w:rFonts w:ascii="Cambria" w:hAnsi="Cambria"/>
+        </w:rPr>
+        <w:t>.</w:t>
       </w:r>
     </w:p>
     <w:p>
@@ -1985,6 +2078,48 @@
           <w:rFonts w:ascii="Cambria" w:hAnsi="Cambria"/>
           <w:b/>
         </w:rPr>
+        <w:t>Condividi sul gruppo.</w:t>
+      </w:r>
+      <w:r>
+        <w:rPr>
+          <w:rFonts w:ascii="Cambria" w:hAnsi="Cambria"/>
+        </w:rPr>
+        <w:t xml:space="preserve"> L'icona </w:t>
+      </w:r>
+      <w:r>
+        <w:rPr>
+          <w:rFonts w:ascii="Consolas" w:hAnsi="Consolas"/>
+          <w:sz w:val="19"/>
+          <w:shd w:val="clear" w:fill="F2F1EC"/>
+        </w:rPr>
+        <w:t>Condividi</w:t>
+      </w:r>
+      <w:r>
+        <w:rPr>
+          <w:rFonts w:ascii="Cambria" w:hAnsi="Cambria"/>
+        </w:rPr>
+        <w:t xml:space="preserve"> in alto nella partita prepara il messaggio con convocati e turni (prima) o risultato e marcatori (dopo), da mandare su WhatsApp o copiare. Lo può fare chiunque, non solo lo staff.</w:t>
+      </w:r>
+    </w:p>
+    <w:p>
+      <w:pPr>
+        <w:spacing w:after="100" w:before="0"/>
+        <w:ind w:left="461" w:hanging="461"/>
+      </w:pPr>
+      <w:r>
+        <w:rPr>
+          <w:rFonts w:ascii="Segoe UI" w:hAnsi="Segoe UI"/>
+          <w:b/>
+          <w:color w:val="006B45"/>
+        </w:rPr>
+        <w:t>7.</w:t>
+        <w:tab/>
+      </w:r>
+      <w:r>
+        <w:rPr>
+          <w:rFonts w:ascii="Cambria" w:hAnsi="Cambria"/>
+          <w:b/>
+        </w:rPr>
         <w:t>Vota il migliore in campo.</w:t>
       </w:r>
       <w:r>
@@ -2118,7 +2253,7 @@
           <w:rFonts w:ascii="Cambria" w:hAnsi="Cambria"/>
           <w:i/>
         </w:rPr>
-        <w:t>Convocato ✓</w:t>
+        <w:t>Convocato</w:t>
       </w:r>
       <w:r>
         <w:rPr>
@@ -3272,6 +3407,87 @@
           <w:color w:val="4C4B45"/>
         </w:rPr>
         <w:t>. Se non sei stato convocato il riquadro chiede la disponibilità, che serve al mister per scegliere.</w:t>
+      </w:r>
+    </w:p>
+    <w:p>
+      <w:pPr>
+        <w:spacing w:after="40" w:before="120"/>
+      </w:pPr>
+      <w:r>
+        <w:rPr>
+          <w:rFonts w:ascii="Segoe UI" w:hAnsi="Segoe UI"/>
+          <w:b/>
+          <w:sz w:val="21"/>
+        </w:rPr>
+        <w:t>Sono l'allenatore e non gioco, ma compaio tra i giocatori</w:t>
+      </w:r>
+    </w:p>
+    <w:p>
+      <w:pPr>
+        <w:spacing w:after="80" w:before="0"/>
+      </w:pPr>
+      <w:r>
+        <w:rPr>
+          <w:rFonts w:ascii="Cambria" w:hAnsi="Cambria"/>
+          <w:color w:val="4C4B45"/>
+        </w:rPr>
+        <w:t xml:space="preserve">Chiedi all'amministratore di accendere </w:t>
+      </w:r>
+      <w:r>
+        <w:rPr>
+          <w:rFonts w:ascii="Consolas" w:hAnsi="Consolas"/>
+          <w:color w:val="4C4B45"/>
+          <w:sz w:val="19"/>
+          <w:shd w:val="clear" w:fill="F2F1EC"/>
+        </w:rPr>
+        <w:t>Solo staff, non gioca</w:t>
+      </w:r>
+      <w:r>
+        <w:rPr>
+          <w:rFonts w:ascii="Cambria" w:hAnsi="Cambria"/>
+          <w:color w:val="4C4B45"/>
+        </w:rPr>
+        <w:t xml:space="preserve"> sulla tua scheda. Da quel momento dai la presenza come tutti ma compari nel riquadro </w:t>
+      </w:r>
+      <w:r>
+        <w:rPr>
+          <w:rFonts w:ascii="Cambria" w:hAnsi="Cambria"/>
+          <w:i/>
+          <w:color w:val="4C4B45"/>
+        </w:rPr>
+        <w:t>In panchina</w:t>
+      </w:r>
+      <w:r>
+        <w:rPr>
+          <w:rFonts w:ascii="Cambria" w:hAnsi="Cambria"/>
+          <w:color w:val="4C4B45"/>
+        </w:rPr>
+        <w:t>, e non vieni contato nella rosa né convocato.</w:t>
+      </w:r>
+    </w:p>
+    <w:p>
+      <w:pPr>
+        <w:spacing w:after="40" w:before="120"/>
+      </w:pPr>
+      <w:r>
+        <w:rPr>
+          <w:rFonts w:ascii="Segoe UI" w:hAnsi="Segoe UI"/>
+          <w:b/>
+          <w:sz w:val="21"/>
+        </w:rPr>
+        <w:t>Mi è arrivato "convocazione revocata"</w:t>
+      </w:r>
+    </w:p>
+    <w:p>
+      <w:pPr>
+        <w:spacing w:after="80" w:before="0"/>
+      </w:pPr>
+      <w:r>
+        <w:rPr>
+          <w:rFonts w:ascii="Cambria" w:hAnsi="Cambria"/>
+          <w:color w:val="4C4B45"/>
+        </w:rPr>
+        <w:t>Il mister ti ha tolto dalla lista di quella partita, di solito per far posto a un cambio o perché la rosa era al completo. Non è un errore dell'app: se hai dubbi chiediglielo. La tua disponibilità resta salvata.</w:t>
       </w:r>
     </w:p>
     <w:p>

</xml_diff>